<commit_message>
3.2 Searching for elements
</commit_message>
<xml_diff>
--- a/바닐라자바스크립트.docx
+++ b/바닐라자바스크립트.docx
@@ -65,7 +65,7 @@
                     <pic:cNvPicPr/>
                   </pic:nvPicPr>
                   <pic:blipFill>
-                    <a:blip r:embed="rId5"/>
+                    <a:blip r:embed="rId7"/>
                     <a:stretch>
                       <a:fillRect/>
                     </a:stretch>
@@ -232,7 +232,7 @@
                     <pic:cNvPicPr/>
                   </pic:nvPicPr>
                   <pic:blipFill>
-                    <a:blip r:embed="rId6"/>
+                    <a:blip r:embed="rId8"/>
                     <a:stretch>
                       <a:fillRect/>
                     </a:stretch>
@@ -288,17 +288,192 @@
       </w:r>
     </w:p>
     <w:p>
-      <w:pPr>
-        <w:rPr>
-          <w:rFonts w:hint="eastAsia"/>
-        </w:rPr>
-      </w:pPr>
       <w:r>
         <w:rPr>
           <w:rFonts w:hint="eastAsia"/>
         </w:rPr>
         <w:lastRenderedPageBreak/>
         <w:t>2-14 들을 차례</w:t>
+      </w:r>
+    </w:p>
+    <w:p/>
+    <w:p>
+      <w:pPr>
+        <w:widowControl/>
+        <w:shd w:val="clear" w:color="auto" w:fill="121314"/>
+        <w:wordWrap/>
+        <w:autoSpaceDE/>
+        <w:autoSpaceDN/>
+        <w:spacing w:after="0" w:line="285" w:lineRule="atLeast"/>
+        <w:rPr>
+          <w:rFonts w:ascii="Consolas" w:eastAsia="굴림" w:hAnsi="Consolas" w:cs="굴림"/>
+          <w:noProof w:val="0"/>
+          <w:color w:val="BBBEBF"/>
+          <w:kern w:val="0"/>
+          <w:sz w:val="21"/>
+          <w:szCs w:val="21"/>
+          <w14:ligatures w14:val="none"/>
+        </w:rPr>
+      </w:pPr>
+      <w:r>
+        <w:rPr>
+          <w:rFonts w:ascii="Consolas" w:eastAsia="굴림" w:hAnsi="Consolas" w:cs="굴림"/>
+          <w:noProof w:val="0"/>
+          <w:color w:val="FF7B72"/>
+          <w:kern w:val="0"/>
+          <w:sz w:val="21"/>
+          <w:szCs w:val="21"/>
+          <w14:ligatures w14:val="none"/>
+        </w:rPr>
+        <w:t>const</w:t>
+      </w:r>
+      <w:r>
+        <w:rPr>
+          <w:rFonts w:ascii="Consolas" w:eastAsia="굴림" w:hAnsi="Consolas" w:cs="굴림"/>
+          <w:noProof w:val="0"/>
+          <w:color w:val="BBBEBF"/>
+          <w:kern w:val="0"/>
+          <w:sz w:val="21"/>
+          <w:szCs w:val="21"/>
+          <w14:ligatures w14:val="none"/>
+        </w:rPr>
+        <w:t xml:space="preserve"> </w:t>
+      </w:r>
+      <w:r>
+        <w:rPr>
+          <w:rFonts w:ascii="Consolas" w:eastAsia="굴림" w:hAnsi="Consolas" w:cs="굴림"/>
+          <w:noProof w:val="0"/>
+          <w:color w:val="79C0FF"/>
+          <w:kern w:val="0"/>
+          <w:sz w:val="21"/>
+          <w:szCs w:val="21"/>
+          <w14:ligatures w14:val="none"/>
+        </w:rPr>
+        <w:t>hellos</w:t>
+      </w:r>
+      <w:r>
+        <w:rPr>
+          <w:rFonts w:ascii="Consolas" w:eastAsia="굴림" w:hAnsi="Consolas" w:cs="굴림"/>
+          <w:noProof w:val="0"/>
+          <w:color w:val="BBBEBF"/>
+          <w:kern w:val="0"/>
+          <w:sz w:val="21"/>
+          <w:szCs w:val="21"/>
+          <w14:ligatures w14:val="none"/>
+        </w:rPr>
+        <w:t xml:space="preserve"> </w:t>
+      </w:r>
+      <w:r>
+        <w:rPr>
+          <w:rFonts w:ascii="Consolas" w:eastAsia="굴림" w:hAnsi="Consolas" w:cs="굴림"/>
+          <w:noProof w:val="0"/>
+          <w:color w:val="D4D4D4"/>
+          <w:kern w:val="0"/>
+          <w:sz w:val="21"/>
+          <w:szCs w:val="21"/>
+          <w14:ligatures w14:val="none"/>
+        </w:rPr>
+        <w:t>=</w:t>
+      </w:r>
+      <w:r>
+        <w:rPr>
+          <w:rFonts w:ascii="Consolas" w:eastAsia="굴림" w:hAnsi="Consolas" w:cs="굴림"/>
+          <w:noProof w:val="0"/>
+          <w:color w:val="BBBEBF"/>
+          <w:kern w:val="0"/>
+          <w:sz w:val="21"/>
+          <w:szCs w:val="21"/>
+          <w14:ligatures w14:val="none"/>
+        </w:rPr>
+        <w:t xml:space="preserve"> </w:t>
+      </w:r>
+      <w:r>
+        <w:rPr>
+          <w:rFonts w:ascii="Consolas" w:eastAsia="굴림" w:hAnsi="Consolas" w:cs="굴림"/>
+          <w:noProof w:val="0"/>
+          <w:color w:val="79C0FF"/>
+          <w:kern w:val="0"/>
+          <w:sz w:val="21"/>
+          <w:szCs w:val="21"/>
+          <w14:ligatures w14:val="none"/>
+        </w:rPr>
+        <w:t>document</w:t>
+      </w:r>
+      <w:r>
+        <w:rPr>
+          <w:rFonts w:ascii="Consolas" w:eastAsia="굴림" w:hAnsi="Consolas" w:cs="굴림"/>
+          <w:noProof w:val="0"/>
+          <w:color w:val="BBBEBF"/>
+          <w:kern w:val="0"/>
+          <w:sz w:val="21"/>
+          <w:szCs w:val="21"/>
+          <w14:ligatures w14:val="none"/>
+        </w:rPr>
+        <w:t>.</w:t>
+      </w:r>
+      <w:r>
+        <w:rPr>
+          <w:rFonts w:ascii="Consolas" w:eastAsia="굴림" w:hAnsi="Consolas" w:cs="굴림"/>
+          <w:noProof w:val="0"/>
+          <w:color w:val="D2A8FF"/>
+          <w:kern w:val="0"/>
+          <w:sz w:val="21"/>
+          <w:szCs w:val="21"/>
+          <w14:ligatures w14:val="none"/>
+        </w:rPr>
+        <w:t>querySelector</w:t>
+      </w:r>
+      <w:r>
+        <w:rPr>
+          <w:rFonts w:ascii="Consolas" w:eastAsia="굴림" w:hAnsi="Consolas" w:cs="굴림"/>
+          <w:noProof w:val="0"/>
+          <w:color w:val="BBBEBF"/>
+          <w:kern w:val="0"/>
+          <w:sz w:val="21"/>
+          <w:szCs w:val="21"/>
+          <w14:ligatures w14:val="none"/>
+        </w:rPr>
+        <w:t>(</w:t>
+      </w:r>
+      <w:r>
+        <w:rPr>
+          <w:rFonts w:ascii="Consolas" w:eastAsia="굴림" w:hAnsi="Consolas" w:cs="굴림"/>
+          <w:noProof w:val="0"/>
+          <w:color w:val="A5D6FF"/>
+          <w:kern w:val="0"/>
+          <w:sz w:val="21"/>
+          <w:szCs w:val="21"/>
+          <w14:ligatures w14:val="none"/>
+        </w:rPr>
+        <w:t>".hello h1"</w:t>
+      </w:r>
+      <w:r>
+        <w:rPr>
+          <w:rFonts w:ascii="Consolas" w:eastAsia="굴림" w:hAnsi="Consolas" w:cs="굴림"/>
+          <w:noProof w:val="0"/>
+          <w:color w:val="BBBEBF"/>
+          <w:kern w:val="0"/>
+          <w:sz w:val="21"/>
+          <w:szCs w:val="21"/>
+          <w14:ligatures w14:val="none"/>
+        </w:rPr>
+        <w:t>);</w:t>
+      </w:r>
+    </w:p>
+    <w:p>
+      <w:pPr>
+        <w:rPr>
+          <w:rFonts w:hint="eastAsia"/>
+        </w:rPr>
+      </w:pPr>
+      <w:r>
+        <w:t xml:space="preserve">를 </w:t>
+      </w:r>
+      <w:r>
+        <w:rPr>
+          <w:rFonts w:hint="eastAsia"/>
+        </w:rPr>
+        <w:t>많이 사용</w:t>
       </w:r>
       <w:bookmarkStart w:id="0" w:name="_GoBack"/>
       <w:bookmarkEnd w:id="0"/>
@@ -311,6 +486,56 @@
     </w:sectPr>
   </w:body>
 </w:document>
+</file>
+
+<file path=word/endnotes.xml><?xml version="1.0" encoding="utf-8"?>
+<w:endnotes xmlns:wpc="http://schemas.microsoft.com/office/word/2010/wordprocessingCanvas" xmlns:cx="http://schemas.microsoft.com/office/drawing/2014/chartex" xmlns:mc="http://schemas.openxmlformats.org/markup-compatibility/2006" xmlns:o="urn:schemas-microsoft-com:office:office" xmlns:r="http://schemas.openxmlformats.org/officeDocument/2006/relationships" xmlns:m="http://schemas.openxmlformats.org/officeDocument/2006/math" xmlns:v="urn:schemas-microsoft-com:vml" xmlns:wp14="http://schemas.microsoft.com/office/word/2010/wordprocessingDrawing" xmlns:wp="http://schemas.openxmlformats.org/drawingml/2006/wordprocessingDrawing" xmlns:w10="urn:schemas-microsoft-com:office:word" xmlns:w="http://schemas.openxmlformats.org/wordprocessingml/2006/main" xmlns:w14="http://schemas.microsoft.com/office/word/2010/wordml" xmlns:w15="http://schemas.microsoft.com/office/word/2012/wordml" xmlns:w16se="http://schemas.microsoft.com/office/word/2015/wordml/symex" xmlns:wpg="http://schemas.microsoft.com/office/word/2010/wordprocessingGroup" xmlns:wpi="http://schemas.microsoft.com/office/word/2010/wordprocessingInk" xmlns:wne="http://schemas.microsoft.com/office/word/2006/wordml" xmlns:wps="http://schemas.microsoft.com/office/word/2010/wordprocessingShape" mc:Ignorable="w14 w15 w16se wp14">
+  <w:endnote w:type="separator" w:id="-1">
+    <w:p>
+      <w:pPr>
+        <w:spacing w:after="0"/>
+      </w:pPr>
+      <w:r>
+        <w:separator/>
+      </w:r>
+    </w:p>
+  </w:endnote>
+  <w:endnote w:type="continuationSeparator" w:id="0">
+    <w:p>
+      <w:pPr>
+        <w:spacing w:after="0"/>
+      </w:pPr>
+      <w:r>
+        <w:continuationSeparator/>
+      </w:r>
+    </w:p>
+  </w:endnote>
+</w:endnotes>
+</file>
+
+<file path=word/footnotes.xml><?xml version="1.0" encoding="utf-8"?>
+<w:footnotes xmlns:wpc="http://schemas.microsoft.com/office/word/2010/wordprocessingCanvas" xmlns:cx="http://schemas.microsoft.com/office/drawing/2014/chartex" xmlns:mc="http://schemas.openxmlformats.org/markup-compatibility/2006" xmlns:o="urn:schemas-microsoft-com:office:office" xmlns:r="http://schemas.openxmlformats.org/officeDocument/2006/relationships" xmlns:m="http://schemas.openxmlformats.org/officeDocument/2006/math" xmlns:v="urn:schemas-microsoft-com:vml" xmlns:wp14="http://schemas.microsoft.com/office/word/2010/wordprocessingDrawing" xmlns:wp="http://schemas.openxmlformats.org/drawingml/2006/wordprocessingDrawing" xmlns:w10="urn:schemas-microsoft-com:office:word" xmlns:w="http://schemas.openxmlformats.org/wordprocessingml/2006/main" xmlns:w14="http://schemas.microsoft.com/office/word/2010/wordml" xmlns:w15="http://schemas.microsoft.com/office/word/2012/wordml" xmlns:w16se="http://schemas.microsoft.com/office/word/2015/wordml/symex" xmlns:wpg="http://schemas.microsoft.com/office/word/2010/wordprocessingGroup" xmlns:wpi="http://schemas.microsoft.com/office/word/2010/wordprocessingInk" xmlns:wne="http://schemas.microsoft.com/office/word/2006/wordml" xmlns:wps="http://schemas.microsoft.com/office/word/2010/wordprocessingShape" mc:Ignorable="w14 w15 w16se wp14">
+  <w:footnote w:type="separator" w:id="-1">
+    <w:p>
+      <w:pPr>
+        <w:spacing w:after="0"/>
+      </w:pPr>
+      <w:r>
+        <w:separator/>
+      </w:r>
+    </w:p>
+  </w:footnote>
+  <w:footnote w:type="continuationSeparator" w:id="0">
+    <w:p>
+      <w:pPr>
+        <w:spacing w:after="0"/>
+      </w:pPr>
+      <w:r>
+        <w:continuationSeparator/>
+      </w:r>
+    </w:p>
+  </w:footnote>
+</w:footnotes>
 </file>
 
 <file path=word/numbering.xml><?xml version="1.0" encoding="utf-8"?>
@@ -1475,6 +1700,56 @@
       <w:spacing w:val="5"/>
     </w:rPr>
   </w:style>
+  <w:style w:type="paragraph" w:styleId="aa">
+    <w:name w:val="header"/>
+    <w:basedOn w:val="a"/>
+    <w:link w:val="Char3"/>
+    <w:uiPriority w:val="99"/>
+    <w:unhideWhenUsed/>
+    <w:rsid w:val="00413BD1"/>
+    <w:pPr>
+      <w:tabs>
+        <w:tab w:val="center" w:pos="4513"/>
+        <w:tab w:val="right" w:pos="9026"/>
+      </w:tabs>
+      <w:snapToGrid w:val="0"/>
+    </w:pPr>
+  </w:style>
+  <w:style w:type="character" w:customStyle="1" w:styleId="Char3">
+    <w:name w:val="머리글 Char"/>
+    <w:basedOn w:val="a0"/>
+    <w:link w:val="aa"/>
+    <w:uiPriority w:val="99"/>
+    <w:rsid w:val="00413BD1"/>
+    <w:rPr>
+      <w:noProof/>
+    </w:rPr>
+  </w:style>
+  <w:style w:type="paragraph" w:styleId="ab">
+    <w:name w:val="footer"/>
+    <w:basedOn w:val="a"/>
+    <w:link w:val="Char4"/>
+    <w:uiPriority w:val="99"/>
+    <w:unhideWhenUsed/>
+    <w:rsid w:val="00413BD1"/>
+    <w:pPr>
+      <w:tabs>
+        <w:tab w:val="center" w:pos="4513"/>
+        <w:tab w:val="right" w:pos="9026"/>
+      </w:tabs>
+      <w:snapToGrid w:val="0"/>
+    </w:pPr>
+  </w:style>
+  <w:style w:type="character" w:customStyle="1" w:styleId="Char4">
+    <w:name w:val="바닥글 Char"/>
+    <w:basedOn w:val="a0"/>
+    <w:link w:val="ab"/>
+    <w:uiPriority w:val="99"/>
+    <w:rsid w:val="00413BD1"/>
+    <w:rPr>
+      <w:noProof/>
+    </w:rPr>
+  </w:style>
 </w:styles>
 </file>
 

</xml_diff>